<commit_message>
adding file load, somewhat working, missing images, not auto AI load
</commit_message>
<xml_diff>
--- a/ASR App.docx
+++ b/ASR App.docx
@@ -32,11 +32,16 @@
     </w:p>
     <w:p>
       <w:r>
-        <w:t>File browser for loading wa</w:t>
+        <w:t xml:space="preserve">File browser for loading </w:t>
+      </w:r>
+      <w:proofErr w:type="gramStart"/>
+      <w:r>
+        <w:t>wa</w:t>
       </w:r>
       <w:r>
         <w:t>v</w:t>
       </w:r>
+      <w:proofErr w:type="gramEnd"/>
       <w:r>
         <w:t xml:space="preserve"> or mp3 file (optional)</w:t>
       </w:r>
@@ -53,85 +58,679 @@
       <w:r>
         <w:t xml:space="preserve">Check box for </w:t>
       </w:r>
-      <w:r>
-        <w:t>punctuation,</w:t>
+      <w:proofErr w:type="gramStart"/>
+      <w:r>
+        <w:t>punctuation,  and</w:t>
+      </w:r>
+      <w:proofErr w:type="gramEnd"/>
+      <w:r>
+        <w:t xml:space="preserve"> word time</w:t>
+      </w:r>
+    </w:p>
+    <w:p>
+      <w:proofErr w:type="gramStart"/>
+      <w:r>
+        <w:t>Text-box</w:t>
+      </w:r>
+      <w:proofErr w:type="gramEnd"/>
+      <w:r>
+        <w:t xml:space="preserve"> for ASR output</w:t>
+      </w:r>
+      <w:r>
+        <w:t xml:space="preserve">. 5 lines scrollable. </w:t>
+      </w:r>
+    </w:p>
+    <w:p>
+      <w:r>
+        <w:t>Save text, and exit buttons</w:t>
+      </w:r>
+    </w:p>
+    <w:p/>
+    <w:p>
+      <w:r>
+        <w:t>Configuration window</w:t>
+      </w:r>
+    </w:p>
+    <w:p>
+      <w:r>
+        <w:t>Pull-down for Google or Whisper</w:t>
+      </w:r>
+    </w:p>
+    <w:p>
+      <w:r>
+        <w:t>Pull-down select language,</w:t>
+      </w:r>
+    </w:p>
+    <w:p>
+      <w:r>
+        <w:t>pull-down for model</w:t>
+      </w:r>
+      <w:r>
+        <w:t>s (Google and Whisper)</w:t>
+      </w:r>
+    </w:p>
+    <w:p>
+      <w:r>
+        <w:t>Entry box and pull-down for other settings.</w:t>
+      </w:r>
+      <w:r>
+        <w:t xml:space="preserve"> Use common defaults. </w:t>
+      </w:r>
+    </w:p>
+    <w:p/>
+    <w:p/>
+    <w:p>
+      <w:r>
+        <w:t xml:space="preserve">Remove </w:t>
+      </w:r>
+      <w:r>
+        <w:t>requirements</w:t>
+      </w:r>
+      <w:r>
+        <w:t xml:space="preserve"> text from code and make requirements.txt file</w:t>
+      </w:r>
+    </w:p>
+    <w:p/>
+    <w:p>
+      <w:r>
+        <w:t xml:space="preserve">Pronunciation feedback tab doesn’t appear to be working. Correct and add debugging as needed. </w:t>
       </w:r>
       <w:r>
         <w:t xml:space="preserve"> </w:t>
       </w:r>
+    </w:p>
+    <w:p/>
+    <w:p>
+      <w:proofErr w:type="spellStart"/>
+      <w:r>
+        <w:t>Αυτός</w:t>
+      </w:r>
+      <w:proofErr w:type="spellEnd"/>
+      <w:r>
+        <w:t xml:space="preserve"> β</w:t>
+      </w:r>
+      <w:proofErr w:type="spellStart"/>
+      <w:r>
+        <w:t>λέ</w:t>
+      </w:r>
+      <w:proofErr w:type="spellEnd"/>
+      <w:r>
+        <w:t xml:space="preserve">πει </w:t>
+      </w:r>
+      <w:proofErr w:type="spellStart"/>
+      <w:r>
+        <w:t>τήν</w:t>
+      </w:r>
+      <w:proofErr w:type="spellEnd"/>
       <w:r>
         <w:t xml:space="preserve"> </w:t>
       </w:r>
-      <w:r>
-        <w:t>and</w:t>
-      </w:r>
-      <w:r>
-        <w:t xml:space="preserve"> word</w:t>
+      <w:proofErr w:type="spellStart"/>
+      <w:r>
+        <w:t>γυν</w:t>
+      </w:r>
+      <w:proofErr w:type="spellEnd"/>
+      <w:r>
+        <w:t>αίκα</w:t>
+      </w:r>
+    </w:p>
+    <w:p/>
+    <w:p/>
+    <w:p/>
+    <w:p>
+      <w:r>
+        <w:t xml:space="preserve">Change the record button, from 10 seconds, to push to start, push to stop. </w:t>
+      </w:r>
+    </w:p>
+    <w:p/>
+    <w:p/>
+    <w:p>
+      <w:r>
+        <w:t xml:space="preserve">Add </w:t>
+      </w:r>
+      <w:proofErr w:type="spellStart"/>
+      <w:r>
+        <w:t>gTTS</w:t>
+      </w:r>
+      <w:proofErr w:type="spellEnd"/>
+      <w:r>
+        <w:t xml:space="preserve"> (text to speech) to app. Add play </w:t>
+      </w:r>
+      <w:proofErr w:type="gramStart"/>
+      <w:r>
+        <w:t>TTS  button</w:t>
+      </w:r>
+      <w:proofErr w:type="gramEnd"/>
+      <w:r>
+        <w:t xml:space="preserve"> right side of “Reference Text” </w:t>
+      </w:r>
+      <w:proofErr w:type="gramStart"/>
+      <w:r>
+        <w:t>text-box</w:t>
+      </w:r>
+      <w:proofErr w:type="gramEnd"/>
+      <w:r>
+        <w:t xml:space="preserve">. Use </w:t>
+      </w:r>
+      <w:proofErr w:type="gramStart"/>
+      <w:r>
+        <w:t>save</w:t>
+      </w:r>
+      <w:proofErr w:type="gramEnd"/>
+      <w:r>
+        <w:t xml:space="preserve"> language and default as ASR. Update requirements.txt to support new </w:t>
+      </w:r>
+      <w:proofErr w:type="spellStart"/>
+      <w:r>
+        <w:t>gTTS</w:t>
+      </w:r>
+      <w:proofErr w:type="spellEnd"/>
+      <w:r>
+        <w:t xml:space="preserve"> libraries. </w:t>
+      </w:r>
+    </w:p>
+    <w:p/>
+    <w:p>
+      <w:r>
+        <w:t xml:space="preserve">Add new check </w:t>
+      </w:r>
+      <w:proofErr w:type="gramStart"/>
+      <w:r>
+        <w:t>box</w:t>
+      </w:r>
+      <w:proofErr w:type="gramEnd"/>
+      <w:r>
+        <w:t xml:space="preserve"> the </w:t>
+      </w:r>
+      <w:proofErr w:type="gramStart"/>
+      <w:r>
+        <w:t>right of</w:t>
+      </w:r>
+      <w:proofErr w:type="gramEnd"/>
+      <w:r>
+        <w:t xml:space="preserve"> Word Timestamp, Auto check after record.</w:t>
+      </w:r>
+    </w:p>
+    <w:p>
+      <w:r>
+        <w:t xml:space="preserve">Add status/debug text box (3 lines, scorable) to the </w:t>
+      </w:r>
+      <w:proofErr w:type="gramStart"/>
+      <w:r>
+        <w:t>bottom</w:t>
+      </w:r>
+      <w:proofErr w:type="gramEnd"/>
+      <w:r>
+        <w:t xml:space="preserve"> the main window, above save text</w:t>
+      </w:r>
+    </w:p>
+    <w:p>
+      <w:r>
+        <w:t xml:space="preserve">  </w:t>
+      </w:r>
+    </w:p>
+    <w:p>
+      <w:r>
+        <w:t xml:space="preserve">Add </w:t>
+      </w:r>
+      <w:proofErr w:type="gramStart"/>
+      <w:r>
+        <w:t>to</w:t>
+      </w:r>
+      <w:proofErr w:type="gramEnd"/>
+      <w:r>
+        <w:t xml:space="preserve"> new configuration tab for </w:t>
+      </w:r>
+      <w:proofErr w:type="spellStart"/>
+      <w:r>
+        <w:t>Ollama</w:t>
+      </w:r>
+      <w:proofErr w:type="spellEnd"/>
+      <w:r>
+        <w:t xml:space="preserve"> AI interface. Add pull-down for affable models, default=</w:t>
       </w:r>
       <w:r>
         <w:t xml:space="preserve"> </w:t>
       </w:r>
       <w:r>
-        <w:t>time</w:t>
-      </w:r>
-    </w:p>
-    <w:p>
-      <w:r>
-        <w:t>Text-box for ASR output</w:t>
-      </w:r>
-      <w:r>
-        <w:t xml:space="preserve">. 5 lines scrollable. </w:t>
-      </w:r>
-    </w:p>
-    <w:p>
-      <w:r>
-        <w:t xml:space="preserve">Save text, and </w:t>
-      </w:r>
-      <w:r>
-        <w:t>exit buttons</w:t>
-      </w:r>
-    </w:p>
-    <w:p/>
-    <w:p>
-      <w:r>
-        <w:t>Configuration window</w:t>
-      </w:r>
-    </w:p>
-    <w:p>
-      <w:r>
-        <w:t>Pull-down for Google or Whisper</w:t>
-      </w:r>
-    </w:p>
-    <w:p>
-      <w:r>
-        <w:t>Pull-down select language,</w:t>
-      </w:r>
-    </w:p>
-    <w:p>
-      <w:r>
-        <w:t>pull-down for model</w:t>
-      </w:r>
-      <w:r>
-        <w:t>s (Google and Whisper)</w:t>
-      </w:r>
-    </w:p>
-    <w:p>
-      <w:r>
-        <w:t>Entry box and pull-down for other settings.</w:t>
-      </w:r>
-      <w:r>
-        <w:t xml:space="preserve"> Use common defaults. </w:t>
-      </w:r>
-    </w:p>
-    <w:p/>
-    <w:p/>
-    <w:p>
-      <w:r>
-        <w:t xml:space="preserve">Show all setup requirements. </w:t>
-      </w:r>
-    </w:p>
-    <w:p/>
-    <w:p/>
+        <w:t>kimi-k2:1t-cloud</w:t>
+      </w:r>
+      <w:r>
+        <w:t>.</w:t>
+      </w:r>
+    </w:p>
+    <w:p>
+      <w:r>
+        <w:t xml:space="preserve">Add button to update model list. </w:t>
+      </w:r>
+    </w:p>
+    <w:p>
+      <w:r>
+        <w:t>Add button to test and verify AI model is working.</w:t>
+      </w:r>
+    </w:p>
+    <w:p>
+      <w:r>
+        <w:t xml:space="preserve">Add </w:t>
+      </w:r>
+      <w:proofErr w:type="gramStart"/>
+      <w:r>
+        <w:t>text-box</w:t>
+      </w:r>
+      <w:proofErr w:type="gramEnd"/>
+      <w:r>
+        <w:t xml:space="preserve"> to show AI model test and status. </w:t>
+      </w:r>
+    </w:p>
+    <w:p>
+      <w:r>
+        <w:lastRenderedPageBreak/>
+        <w:t>Add check box to show pronunciation, next to Enable Pronunciation training.</w:t>
+      </w:r>
+    </w:p>
+    <w:p>
+      <w:r>
+        <w:t xml:space="preserve">Add check box to show definition/translation  </w:t>
+      </w:r>
+    </w:p>
+    <w:p>
+      <w:r>
+        <w:t xml:space="preserve">Add </w:t>
+      </w:r>
+      <w:proofErr w:type="gramStart"/>
+      <w:r>
+        <w:t>text-box</w:t>
+      </w:r>
+      <w:proofErr w:type="gramEnd"/>
+      <w:r>
+        <w:t xml:space="preserve">, word/phase pronunciation, from </w:t>
+      </w:r>
+      <w:proofErr w:type="spellStart"/>
+      <w:r>
+        <w:t>Ollama</w:t>
+      </w:r>
+      <w:proofErr w:type="spellEnd"/>
+      <w:r>
+        <w:t xml:space="preserve"> </w:t>
+      </w:r>
+      <w:r>
+        <w:t>AI</w:t>
+      </w:r>
+      <w:r>
+        <w:t>, locate under reference text, hide when pronunciation is un-checked.</w:t>
+      </w:r>
+    </w:p>
+    <w:p>
+      <w:r>
+        <w:t xml:space="preserve">Add </w:t>
+      </w:r>
+      <w:proofErr w:type="gramStart"/>
+      <w:r>
+        <w:t>text-box</w:t>
+      </w:r>
+      <w:proofErr w:type="gramEnd"/>
+      <w:r>
+        <w:t xml:space="preserve">, word/phrase definition, </w:t>
+      </w:r>
+      <w:r>
+        <w:t xml:space="preserve">from </w:t>
+      </w:r>
+      <w:proofErr w:type="spellStart"/>
+      <w:r>
+        <w:t>Ollama</w:t>
+      </w:r>
+      <w:proofErr w:type="spellEnd"/>
+      <w:r>
+        <w:t xml:space="preserve"> AI, locate under reference text</w:t>
+      </w:r>
+      <w:r>
+        <w:t xml:space="preserve"> or pronunciation</w:t>
+      </w:r>
+      <w:r>
+        <w:t>, hide when pronunciation is un-checked.</w:t>
+      </w:r>
+    </w:p>
+    <w:p/>
+    <w:p/>
+    <w:p>
+      <w:r>
+        <w:t>Improve AI interface.</w:t>
+      </w:r>
+    </w:p>
+    <w:p>
+      <w:r>
+        <w:t xml:space="preserve">set default, </w:t>
+      </w:r>
+    </w:p>
+    <w:p>
+      <w:r>
+        <w:t xml:space="preserve">Enable Pronunciation Training on </w:t>
+      </w:r>
+    </w:p>
+    <w:p>
+      <w:r>
+        <w:t xml:space="preserve">Reference text, text-box </w:t>
+      </w:r>
+      <w:proofErr w:type="spellStart"/>
+      <w:r>
+        <w:t>visable</w:t>
+      </w:r>
+      <w:proofErr w:type="spellEnd"/>
+    </w:p>
+    <w:p>
+      <w:r>
+        <w:t xml:space="preserve"> </w:t>
+      </w:r>
+      <w:r>
+        <w:t>word/phase pronunciation</w:t>
+      </w:r>
+      <w:r>
+        <w:t xml:space="preserve"> text-box visible</w:t>
+      </w:r>
+    </w:p>
+    <w:p>
+      <w:r>
+        <w:t xml:space="preserve"> </w:t>
+      </w:r>
+      <w:r>
+        <w:t>word/phrase definition</w:t>
+      </w:r>
+      <w:r>
+        <w:t xml:space="preserve"> text-box visible</w:t>
+      </w:r>
+    </w:p>
+    <w:p/>
+    <w:p>
+      <w:r>
+        <w:t>Add AI status indicator far right of check boxes.</w:t>
+      </w:r>
+    </w:p>
+    <w:p>
+      <w:r>
+        <w:t xml:space="preserve">Auto check AI connect </w:t>
+      </w:r>
+    </w:p>
+    <w:p/>
+    <w:p>
+      <w:r>
+        <w:t xml:space="preserve">Reference text, </w:t>
+      </w:r>
+    </w:p>
+    <w:p>
+      <w:r>
+        <w:t>Add load button, send in enquiry to AI word/phrase pronunciation and definition. Send language code also with refence text. Locate to left of Play TTS, also on enter key</w:t>
+      </w:r>
+    </w:p>
+    <w:p/>
+    <w:p>
+      <w:r>
+        <w:t xml:space="preserve">Add slow TTS play button, play reference text one word at a time with short pause. </w:t>
+      </w:r>
+    </w:p>
+    <w:p/>
+    <w:p>
+      <w:r>
+        <w:t>Add “+” and “</w:t>
+      </w:r>
+      <w:proofErr w:type="gramStart"/>
+      <w:r>
+        <w:t>-“ button</w:t>
+      </w:r>
+      <w:proofErr w:type="gramEnd"/>
+      <w:r>
+        <w:t xml:space="preserve"> to change </w:t>
+      </w:r>
+      <w:r>
+        <w:t>font</w:t>
+      </w:r>
+      <w:r>
+        <w:t xml:space="preserve"> size</w:t>
+      </w:r>
+      <w:r>
+        <w:t xml:space="preserve">, in </w:t>
+      </w:r>
+      <w:proofErr w:type="gramStart"/>
+      <w:r>
+        <w:t>text-boxes</w:t>
+      </w:r>
+      <w:proofErr w:type="gramEnd"/>
+      <w:r>
+        <w:t xml:space="preserve">. </w:t>
+      </w:r>
+      <w:r>
+        <w:t xml:space="preserve"> Locate </w:t>
+      </w:r>
+      <w:r>
+        <w:t xml:space="preserve">on </w:t>
+      </w:r>
+      <w:r>
+        <w:t>top left side</w:t>
+      </w:r>
+      <w:r>
+        <w:t xml:space="preserve">. </w:t>
+      </w:r>
+    </w:p>
+    <w:p/>
+    <w:p>
+      <w:pPr>
+        <w:rPr>
+          <w:b/>
+          <w:bCs/>
+        </w:rPr>
+      </w:pPr>
+      <w:r>
+        <w:rPr>
+          <w:b/>
+          <w:bCs/>
+        </w:rPr>
+        <w:t>Add IPA pronunciation</w:t>
+      </w:r>
+    </w:p>
+    <w:p>
+      <w:r>
+        <w:t xml:space="preserve">Add IPA pronunciation to the </w:t>
+      </w:r>
+      <w:proofErr w:type="gramStart"/>
+      <w:r>
+        <w:t>text-box</w:t>
+      </w:r>
+      <w:proofErr w:type="gramEnd"/>
+      <w:r>
+        <w:t xml:space="preserve">. Keep English symbols on the </w:t>
+      </w:r>
+      <w:proofErr w:type="gramStart"/>
+      <w:r>
+        <w:t>top, and</w:t>
+      </w:r>
+      <w:proofErr w:type="gramEnd"/>
+      <w:r>
+        <w:t xml:space="preserve"> add IPA symbols </w:t>
+      </w:r>
+      <w:r>
+        <w:t>underneath</w:t>
+      </w:r>
+      <w:r>
+        <w:t xml:space="preserve"> English symbols. </w:t>
+      </w:r>
+    </w:p>
+    <w:p/>
+    <w:p>
+      <w:r>
+        <w:t>Layout is n</w:t>
+      </w:r>
+      <w:r>
+        <w:t>ot right, combine</w:t>
+      </w:r>
+      <w:r>
+        <w:t xml:space="preserve"> both the English symbol and IPA into</w:t>
+      </w:r>
+      <w:r>
+        <w:t xml:space="preserve"> the pronunciation text box. Top pronunciation in </w:t>
+      </w:r>
+      <w:r>
+        <w:t xml:space="preserve">English symbols, below the pronunciation in IPA symbols. Remove extract text box. </w:t>
+      </w:r>
+    </w:p>
+    <w:p/>
+    <w:p>
+      <w:r>
+        <w:t xml:space="preserve">The AI tool is not returning the IPA and showing in pronunciation </w:t>
+      </w:r>
+      <w:proofErr w:type="gramStart"/>
+      <w:r>
+        <w:t>text-box</w:t>
+      </w:r>
+      <w:proofErr w:type="gramEnd"/>
+      <w:r>
+        <w:t xml:space="preserve">, correct. </w:t>
+      </w:r>
+    </w:p>
+    <w:p/>
+    <w:p>
+      <w:r>
+        <w:t>Still not displaying the correct pronunciation information.</w:t>
+      </w:r>
+      <w:r>
+        <w:t xml:space="preserve"> Use modern pronunciation. Upgrade the AI tool interface to JSON for better response management. </w:t>
+      </w:r>
+      <w:r>
+        <w:t xml:space="preserve"> </w:t>
+      </w:r>
+      <w:r>
+        <w:t xml:space="preserve">Add debugging to AI interface. </w:t>
+      </w:r>
+      <w:r>
+        <w:t>Reference text: should return:</w:t>
+      </w:r>
+    </w:p>
+    <w:p>
+      <w:r>
+        <w:t xml:space="preserve">English symbols: </w:t>
+      </w:r>
+    </w:p>
+    <w:p>
+      <w:r>
+        <w:t xml:space="preserve">IPA: </w:t>
+      </w:r>
+    </w:p>
+    <w:p/>
+    <w:p>
+      <w:r>
+        <w:t xml:space="preserve">In the pronunciation text box, not showing the correct modern pronunciation in English symbols. The IPA seems okay. Unclear if the AI tool is returning the correct response. Add additional debug and correct. </w:t>
+      </w:r>
+    </w:p>
+    <w:p/>
+    <w:p>
+      <w:pPr>
+        <w:rPr>
+          <w:b/>
+          <w:bCs/>
+        </w:rPr>
+      </w:pPr>
+      <w:r>
+        <w:rPr>
+          <w:b/>
+          <w:bCs/>
+        </w:rPr>
+        <w:t>Add vocabulary file load.</w:t>
+      </w:r>
+    </w:p>
+    <w:p>
+      <w:r>
+        <w:t xml:space="preserve">Locate optional file load above the “Reference Text” box.  Support text and CSV files. </w:t>
+      </w:r>
+    </w:p>
+    <w:p>
+      <w:r>
+        <w:t xml:space="preserve">Use AI tool to file in missing </w:t>
+      </w:r>
+      <w:r>
+        <w:t>Definition</w:t>
+      </w:r>
+      <w:r>
+        <w:t xml:space="preserve"> and </w:t>
+      </w:r>
+      <w:r>
+        <w:t>Pronunciation</w:t>
+      </w:r>
+      <w:r>
+        <w:t xml:space="preserve"> if needed</w:t>
+      </w:r>
+    </w:p>
+    <w:p>
+      <w:r>
+        <w:t xml:space="preserve">Below definition </w:t>
+      </w:r>
+      <w:proofErr w:type="gramStart"/>
+      <w:r>
+        <w:t>text-box</w:t>
+      </w:r>
+      <w:proofErr w:type="gramEnd"/>
+      <w:r>
+        <w:t>, center, add previous and next button (advance to next or last)</w:t>
+      </w:r>
+    </w:p>
+    <w:p/>
+    <w:p>
+      <w:r>
+        <w:t>In configuration window settings for text and CSV files</w:t>
+      </w:r>
+      <w:r>
+        <w:t xml:space="preserve"> </w:t>
+      </w:r>
+    </w:p>
+    <w:p>
+      <w:r>
+        <w:t>Add pull-down to the right for delimiter, “|”, “,”, “;”, tab (default Pipe “|”).</w:t>
+      </w:r>
+    </w:p>
+    <w:p>
+      <w:r>
+        <w:t>Reference text (Word/phrase), pull-down column selection, default column 1</w:t>
+      </w:r>
+    </w:p>
+    <w:p>
+      <w:r>
+        <w:t>Definition</w:t>
+      </w:r>
+      <w:r>
+        <w:t xml:space="preserve"> (Word/phrase), pull-down column selection, default column </w:t>
+      </w:r>
+      <w:r>
+        <w:t>2</w:t>
+      </w:r>
+    </w:p>
+    <w:p>
+      <w:r>
+        <w:t>Pronunciation</w:t>
+      </w:r>
+      <w:r>
+        <w:t xml:space="preserve"> (Word/phrase)</w:t>
+      </w:r>
+      <w:r>
+        <w:t xml:space="preserve"> English symbols</w:t>
+      </w:r>
+      <w:r>
+        <w:t xml:space="preserve">, pull-down column selection, default column </w:t>
+      </w:r>
+      <w:r>
+        <w:t>3</w:t>
+      </w:r>
+    </w:p>
+    <w:p>
+      <w:r>
+        <w:t>Pronunciation (Word/phrase)</w:t>
+      </w:r>
+      <w:r>
+        <w:t xml:space="preserve"> IPA symbols</w:t>
+      </w:r>
+      <w:r>
+        <w:t xml:space="preserve">, pull-down column selection, default column </w:t>
+      </w:r>
+      <w:r>
+        <w:t>4</w:t>
+      </w:r>
+    </w:p>
     <w:sectPr>
       <w:pgSz w:w="12240" w:h="15840"/>
       <w:pgMar w:top="1440" w:right="1440" w:bottom="1440" w:left="1440" w:header="720" w:footer="720" w:gutter="0"/>
@@ -743,7 +1342,6 @@
   <w:style w:type="character" w:default="1" w:styleId="DefaultParagraphFont">
     <w:name w:val="Default Paragraph Font"/>
     <w:uiPriority w:val="1"/>
-    <w:semiHidden/>
     <w:unhideWhenUsed/>
   </w:style>
   <w:style w:type="table" w:default="1" w:styleId="TableNormal">

</xml_diff>

<commit_message>
Update UI layout: reduced definition text box to 1 line, increased pronunciation feedback box size
</commit_message>
<xml_diff>
--- a/ASR App.docx
+++ b/ASR App.docx
@@ -290,10 +290,7 @@
         <w:t xml:space="preserve"> AI interface. Add pull-down for affable models, default=</w:t>
       </w:r>
       <w:r>
-        <w:t xml:space="preserve"> </w:t>
-      </w:r>
-      <w:r>
-        <w:t>kimi-k2:1t-cloud</w:t>
+        <w:t xml:space="preserve"> kimi-k2:1t-cloud</w:t>
       </w:r>
       <w:r>
         <w:t>.</w:t>
@@ -637,7 +634,19 @@
     </w:p>
     <w:p>
       <w:r>
-        <w:t xml:space="preserve">Locate optional file load above the “Reference Text” box.  Support text and CSV files. </w:t>
+        <w:t>Locate optional file load above the “Reference Text” box.  Support text</w:t>
+      </w:r>
+      <w:r>
+        <w:t xml:space="preserve">, </w:t>
+      </w:r>
+      <w:r>
+        <w:t>CSV</w:t>
+      </w:r>
+      <w:r>
+        <w:t>, Zip</w:t>
+      </w:r>
+      <w:r>
+        <w:t xml:space="preserve"> files. </w:t>
       </w:r>
     </w:p>
     <w:p>
@@ -659,6 +668,16 @@
     </w:p>
     <w:p>
       <w:r>
+        <w:t xml:space="preserve">Add check box, Enable Image. Locate right of Show/definition, </w:t>
+      </w:r>
+      <w:proofErr w:type="gramStart"/>
+      <w:r>
+        <w:t>check-box</w:t>
+      </w:r>
+      <w:proofErr w:type="gramEnd"/>
+    </w:p>
+    <w:p>
+      <w:r>
         <w:t xml:space="preserve">Below definition </w:t>
       </w:r>
       <w:proofErr w:type="gramStart"/>
@@ -670,6 +689,11 @@
         <w:t>, center, add previous and next button (advance to next or last)</w:t>
       </w:r>
     </w:p>
+    <w:p>
+      <w:r>
+        <w:t xml:space="preserve">Below Definition add image view box, scale image to fit and center. </w:t>
+      </w:r>
+    </w:p>
     <w:p/>
     <w:p>
       <w:r>
@@ -691,46 +715,157 @@
     </w:p>
     <w:p>
       <w:r>
-        <w:t>Definition</w:t>
-      </w:r>
-      <w:r>
-        <w:t xml:space="preserve"> (Word/phrase), pull-down column selection, default column </w:t>
-      </w:r>
-      <w:r>
-        <w:t>2</w:t>
-      </w:r>
-    </w:p>
-    <w:p>
-      <w:r>
-        <w:t>Pronunciation</w:t>
-      </w:r>
-      <w:r>
-        <w:t xml:space="preserve"> (Word/phrase)</w:t>
+        <w:t>Definition (Word/phrase), pull-down column selection, default column 2</w:t>
+      </w:r>
+    </w:p>
+    <w:p>
+      <w:r>
+        <w:t>Pronunciation (Word/phrase)</w:t>
       </w:r>
       <w:r>
         <w:t xml:space="preserve"> English symbols</w:t>
       </w:r>
       <w:r>
+        <w:t>, pull-down column selection, default column 3</w:t>
+      </w:r>
+    </w:p>
+    <w:p>
+      <w:r>
+        <w:t>Pronunciation (Word/phrase)</w:t>
+      </w:r>
+      <w:r>
+        <w:t xml:space="preserve"> IPA symbols</w:t>
+      </w:r>
+      <w:r>
         <w:t xml:space="preserve">, pull-down column selection, default column </w:t>
       </w:r>
       <w:r>
-        <w:t>3</w:t>
-      </w:r>
-    </w:p>
-    <w:p>
-      <w:r>
-        <w:t>Pronunciation (Word/phrase)</w:t>
-      </w:r>
-      <w:r>
-        <w:t xml:space="preserve"> IPA symbols</w:t>
-      </w:r>
-      <w:r>
-        <w:t xml:space="preserve">, pull-down column selection, default column </w:t>
-      </w:r>
-      <w:r>
         <w:t>4</w:t>
       </w:r>
     </w:p>
+    <w:p>
+      <w:r>
+        <w:t xml:space="preserve">Image Description (optional), </w:t>
+      </w:r>
+      <w:r>
+        <w:t xml:space="preserve">pull-down column selection, default column </w:t>
+      </w:r>
+      <w:r>
+        <w:t>5</w:t>
+      </w:r>
+    </w:p>
+    <w:p>
+      <w:r>
+        <w:t xml:space="preserve">Image Filename (optional), </w:t>
+      </w:r>
+      <w:r>
+        <w:t>pull-down column selection, default column 5</w:t>
+      </w:r>
+    </w:p>
+    <w:p/>
+    <w:p>
+      <w:r>
+        <w:t>Operation</w:t>
+      </w:r>
+    </w:p>
+    <w:p>
+      <w:r>
+        <w:t xml:space="preserve">Load text or CSV, populate pronunciation, and definition form file. If information is missing use AI to generate. </w:t>
+      </w:r>
+    </w:p>
+    <w:p>
+      <w:r>
+        <w:t>For Zip file, locate the reference CSV file</w:t>
+      </w:r>
+      <w:r>
+        <w:t xml:space="preserve"> and load </w:t>
+      </w:r>
+      <w:proofErr w:type="gramStart"/>
+      <w:r>
+        <w:t>images  from</w:t>
+      </w:r>
+      <w:proofErr w:type="gramEnd"/>
+      <w:r>
+        <w:t xml:space="preserve"> sub directory in Zip file. </w:t>
+      </w:r>
+    </w:p>
+    <w:p/>
+    <w:p/>
+    <w:p>
+      <w:r>
+        <w:t>I</w:t>
+      </w:r>
+      <w:r>
+        <w:t>n the image view window, the view box</w:t>
+      </w:r>
+      <w:r>
+        <w:t xml:space="preserve"> shrinks with each image load. Identify problems and correct.   </w:t>
+      </w:r>
+    </w:p>
+    <w:p/>
+    <w:p>
+      <w:r>
+        <w:t>When loading a te</w:t>
+      </w:r>
+      <w:r>
+        <w:t>x</w:t>
+      </w:r>
+      <w:r>
+        <w:t>t o</w:t>
+      </w:r>
+      <w:r>
+        <w:t>r</w:t>
+      </w:r>
+      <w:r>
+        <w:t xml:space="preserve"> CSV file without pronunciation and/or IPA the pronunciation and description text box doesn’t automatically update on load </w:t>
+      </w:r>
+      <w:r>
+        <w:t xml:space="preserve">(file load) </w:t>
+      </w:r>
+      <w:r>
+        <w:t>or next word</w:t>
+      </w:r>
+      <w:r>
+        <w:t xml:space="preserve"> (next button)</w:t>
+      </w:r>
+      <w:r>
+        <w:t xml:space="preserve">. Correct function. </w:t>
+      </w:r>
+    </w:p>
+    <w:p/>
+    <w:p>
+      <w:r>
+        <w:t xml:space="preserve">Update, AI </w:t>
+      </w:r>
+      <w:r>
+        <w:t>status indicator</w:t>
+      </w:r>
+      <w:r>
+        <w:t>:</w:t>
+      </w:r>
+    </w:p>
+    <w:p>
+      <w:r>
+        <w:t>AI Disconnected, Yellow</w:t>
+      </w:r>
+    </w:p>
+    <w:p>
+      <w:r>
+        <w:t>AI Connected, Green</w:t>
+      </w:r>
+    </w:p>
+    <w:p>
+      <w:r>
+        <w:t>AI Busy, Red</w:t>
+      </w:r>
+    </w:p>
+    <w:p/>
+    <w:p>
+      <w:r>
+        <w:t xml:space="preserve"> </w:t>
+      </w:r>
+    </w:p>
+    <w:p/>
     <w:sectPr>
       <w:pgSz w:w="12240" w:h="15840"/>
       <w:pgMar w:top="1440" w:right="1440" w:bottom="1440" w:left="1440" w:header="720" w:footer="720" w:gutter="0"/>
@@ -1342,6 +1477,7 @@
   <w:style w:type="character" w:default="1" w:styleId="DefaultParagraphFont">
     <w:name w:val="Default Paragraph Font"/>
     <w:uiPriority w:val="1"/>
+    <w:semiHidden/>
     <w:unhideWhenUsed/>
   </w:style>
   <w:style w:type="table" w:default="1" w:styleId="TableNormal">

</xml_diff>

<commit_message>
feat: Update text box layout and AI response cleaning
- Set default font size to 14pt for all text boxes (pronunciation, definition, pronunciation help)
- Increase pronunciation help text box height from 80px to 120px (6 lines)
- Enhance clean_ai_response function to remove blank lines from AI responses
- Preserve multiline AI responses while cleaning single-line content
- Add CSS stylesheet declarations for consistent 14pt font rendering
- Add verification scripts for layout changes
</commit_message>
<xml_diff>
--- a/ASR App.docx
+++ b/ASR App.docx
@@ -865,7 +865,74 @@
         <w:t xml:space="preserve"> </w:t>
       </w:r>
     </w:p>
-    <w:p/>
+    <w:p>
+      <w:r>
+        <w:t>Update layout,</w:t>
+      </w:r>
+    </w:p>
+    <w:p>
+      <w:r>
+        <w:t xml:space="preserve">Reduce translation/definition </w:t>
+      </w:r>
+      <w:proofErr w:type="gramStart"/>
+      <w:r>
+        <w:t>text-box</w:t>
+      </w:r>
+      <w:proofErr w:type="gramEnd"/>
+      <w:r>
+        <w:t xml:space="preserve"> to 1text line.</w:t>
+      </w:r>
+    </w:p>
+    <w:p>
+      <w:r>
+        <w:t xml:space="preserve">Increase size of Pronunciation Feedback </w:t>
+      </w:r>
+      <w:proofErr w:type="gramStart"/>
+      <w:r>
+        <w:t>text-box</w:t>
+      </w:r>
+      <w:proofErr w:type="gramEnd"/>
+      <w:r>
+        <w:t xml:space="preserve">, add 5 move lines of text. </w:t>
+      </w:r>
+    </w:p>
+    <w:p/>
+    <w:p>
+      <w:r>
+        <w:t xml:space="preserve">Add new optional pronunciation </w:t>
+      </w:r>
+      <w:proofErr w:type="gramStart"/>
+      <w:r>
+        <w:t>help</w:t>
+      </w:r>
+      <w:proofErr w:type="gramEnd"/>
+      <w:r>
+        <w:t xml:space="preserve"> </w:t>
+      </w:r>
+      <w:proofErr w:type="gramStart"/>
+      <w:r>
+        <w:t>text-box</w:t>
+      </w:r>
+      <w:proofErr w:type="gramEnd"/>
+      <w:r>
+        <w:t xml:space="preserve">. Locate under definition. Make 4 </w:t>
+      </w:r>
+      <w:proofErr w:type="gramStart"/>
+      <w:r>
+        <w:t>line</w:t>
+      </w:r>
+      <w:proofErr w:type="gramEnd"/>
+      <w:r>
+        <w:t xml:space="preserve"> scrollable. Add check box enable, locate right side of show definition/translation. Use AI too to add pronunciation help when enabled. </w:t>
+      </w:r>
+    </w:p>
+    <w:p/>
+    <w:p>
+      <w:r>
+        <w:lastRenderedPageBreak/>
+        <w:t xml:space="preserve">The pronunciation help window doesn’t seem to update with new word loads. </w:t>
+      </w:r>
+    </w:p>
     <w:sectPr>
       <w:pgSz w:w="12240" w:h="15840"/>
       <w:pgMar w:top="1440" w:right="1440" w:bottom="1440" w:left="1440" w:header="720" w:footer="720" w:gutter="0"/>

</xml_diff>

<commit_message>
Save current project state to local repository
- Added Lesson02 vocabulary file with pen and ink images
- Updated documentation file
- Preserved all current UI layouts and configurations
- Maintained pronunciation help text box at 6 lines (120px)
- Kept definition text box at 3 lines (90px)
- Retained text cleaning functionality for blank line removal
</commit_message>
<xml_diff>
--- a/ASR App.docx
+++ b/ASR App.docx
@@ -931,6 +931,210 @@
       <w:r>
         <w:lastRenderedPageBreak/>
         <w:t xml:space="preserve">The pronunciation help window doesn’t seem to update with new word loads. </w:t>
+      </w:r>
+    </w:p>
+    <w:p/>
+    <w:p>
+      <w:r>
+        <w:t xml:space="preserve">Layout of Pronunciation, Definition, and Pronunciation Help </w:t>
+      </w:r>
+      <w:proofErr w:type="gramStart"/>
+      <w:r>
+        <w:t>text-box</w:t>
+      </w:r>
+      <w:proofErr w:type="gramEnd"/>
+      <w:r>
+        <w:t xml:space="preserve">, </w:t>
+      </w:r>
+      <w:proofErr w:type="gramStart"/>
+      <w:r>
+        <w:t>set  default</w:t>
+      </w:r>
+      <w:proofErr w:type="gramEnd"/>
+      <w:r>
+        <w:t xml:space="preserve"> text size to 14pt.</w:t>
+      </w:r>
+    </w:p>
+    <w:p>
+      <w:r>
+        <w:t xml:space="preserve">Increase size of Pronunciation Help </w:t>
+      </w:r>
+      <w:proofErr w:type="gramStart"/>
+      <w:r>
+        <w:t>text-box</w:t>
+      </w:r>
+      <w:proofErr w:type="gramEnd"/>
+      <w:r>
+        <w:t xml:space="preserve"> to 6-lines and remove blank lines when displayed. </w:t>
+      </w:r>
+    </w:p>
+    <w:p/>
+    <w:p>
+      <w:bookmarkStart w:id="0" w:name="_Hlk219871050"/>
+      <w:r>
+        <w:t>Update layout,</w:t>
+      </w:r>
+    </w:p>
+    <w:p>
+      <w:bookmarkStart w:id="1" w:name="_Hlk219871159"/>
+      <w:bookmarkEnd w:id="0"/>
+      <w:r>
+        <w:t>Definition</w:t>
+      </w:r>
+      <w:bookmarkEnd w:id="1"/>
+      <w:r>
+        <w:t xml:space="preserve">, and </w:t>
+      </w:r>
+      <w:bookmarkStart w:id="2" w:name="_Hlk219871118"/>
+      <w:r>
+        <w:t xml:space="preserve">Pronunciation </w:t>
+      </w:r>
+      <w:bookmarkEnd w:id="2"/>
+      <w:r>
+        <w:t xml:space="preserve">Help </w:t>
+      </w:r>
+      <w:proofErr w:type="gramStart"/>
+      <w:r>
+        <w:t>text-box</w:t>
+      </w:r>
+      <w:proofErr w:type="gramEnd"/>
+      <w:r>
+        <w:t xml:space="preserve">, </w:t>
+      </w:r>
+      <w:proofErr w:type="gramStart"/>
+      <w:r>
+        <w:t>set  default</w:t>
+      </w:r>
+      <w:proofErr w:type="gramEnd"/>
+      <w:r>
+        <w:t xml:space="preserve"> text size to 1</w:t>
+      </w:r>
+      <w:r>
+        <w:t>2</w:t>
+      </w:r>
+      <w:r>
+        <w:t>pt</w:t>
+      </w:r>
+      <w:r>
+        <w:t xml:space="preserve"> font</w:t>
+      </w:r>
+      <w:r>
+        <w:t>.</w:t>
+      </w:r>
+    </w:p>
+    <w:p/>
+    <w:p>
+      <w:r>
+        <w:t>Update layout,</w:t>
+      </w:r>
+    </w:p>
+    <w:p>
+      <w:r>
+        <w:t xml:space="preserve">Remove </w:t>
+      </w:r>
+      <w:r>
+        <w:t>font size control Winget above</w:t>
+      </w:r>
+      <w:r>
+        <w:t xml:space="preserve"> </w:t>
+      </w:r>
+      <w:r>
+        <w:t>Definition</w:t>
+      </w:r>
+    </w:p>
+    <w:p>
+      <w:r>
+        <w:t xml:space="preserve">Change </w:t>
+      </w:r>
+      <w:bookmarkStart w:id="3" w:name="_Hlk219957641"/>
+      <w:r>
+        <w:t xml:space="preserve">the font size control to Winget above </w:t>
+      </w:r>
+      <w:r>
+        <w:t>Pronunciation</w:t>
+      </w:r>
+      <w:bookmarkEnd w:id="3"/>
+    </w:p>
+    <w:p/>
+    <w:p>
+      <w:r>
+        <w:t>Update layout,</w:t>
+      </w:r>
+      <w:r>
+        <w:t xml:space="preserve"> </w:t>
+      </w:r>
+      <w:r>
+        <w:t>the font size control to Winget above Pronunciation</w:t>
+      </w:r>
+      <w:r>
+        <w:t xml:space="preserve"> should control the font size for all 3 text boxes below </w:t>
+      </w:r>
+      <w:proofErr w:type="gramStart"/>
+      <w:r>
+        <w:t xml:space="preserve">( </w:t>
+      </w:r>
+      <w:r>
+        <w:t>Pronunciation</w:t>
+      </w:r>
+      <w:proofErr w:type="gramEnd"/>
+      <w:r>
+        <w:t xml:space="preserve">, </w:t>
+      </w:r>
+      <w:r>
+        <w:t>Definition</w:t>
+      </w:r>
+      <w:r>
+        <w:t xml:space="preserve">, and </w:t>
+      </w:r>
+      <w:r>
+        <w:t>Pronunciation</w:t>
+      </w:r>
+      <w:r>
+        <w:t xml:space="preserve"> help)</w:t>
+      </w:r>
+    </w:p>
+    <w:p/>
+    <w:p>
+      <w:r>
+        <w:t xml:space="preserve">Update layout, make definition/translation text box 3 line. </w:t>
+      </w:r>
+    </w:p>
+    <w:p/>
+    <w:p>
+      <w:r>
+        <w:t>Update layout,</w:t>
+      </w:r>
+    </w:p>
+    <w:p>
+      <w:r>
+        <w:t xml:space="preserve">Increase size of Pronunciation Help </w:t>
+      </w:r>
+      <w:proofErr w:type="gramStart"/>
+      <w:r>
+        <w:t>text-box</w:t>
+      </w:r>
+      <w:proofErr w:type="gramEnd"/>
+      <w:r>
+        <w:t xml:space="preserve"> to 6-lines and remove blank lines when displayed.</w:t>
+      </w:r>
+    </w:p>
+    <w:p/>
+    <w:p>
+      <w:r>
+        <w:t>Update layout,</w:t>
+      </w:r>
+    </w:p>
+    <w:p>
+      <w:r>
+        <w:t xml:space="preserve">Increase size of Pronunciation Help </w:t>
+      </w:r>
+      <w:proofErr w:type="gramStart"/>
+      <w:r>
+        <w:t>text-box</w:t>
+      </w:r>
+      <w:proofErr w:type="gramEnd"/>
+      <w:r>
+        <w:t xml:space="preserve"> to 6-lines.</w:t>
       </w:r>
     </w:p>
     <w:sectPr>

</xml_diff>